<commit_message>
Coffee Cart (EN): arreglos de la revisión en los 5 entregables (B1 comparativa cart/trailer/truck en el Word, M1-M7, m1-m15, m21-m24); G1-G9 verdes, regresión 39/39
Via: Claude Code
Co-Authored-By: Claude Opus 5.5 <noreply@anthropic.com>
</commit_message>
<xml_diff>
--- a/astro-site/public/dl/coffee-cart-business-plan/coffee-cart-business-plan.docx
+++ b/astro-site/public/dl/coffee-cart-business-plan/coffee-cart-business-plan.docx
@@ -112,7 +112,7 @@
           <w:color w:val="6B6B6B"/>
           <w:sz w:val="22"/>
         </w:rPr>
-        <w:t>US edition with UK notes · 2026</w:t>
+        <w:t>US edition with UK notes · Version 2.2 · October 2026</w:t>
       </w:r>
     </w:p>
     <w:p>
@@ -315,17 +315,17 @@
     </w:p>
     <w:p>
       <w:r>
-        <w:t>Coffee catering is easy for a client to search for and hard to deliver well. According to DataForSEO (October 2026), people in the U.S. search "coffee catering" about 2,900 times a month, "mobile coffee bar" and "coffee bar for wedding" about 880 and 720, "coffee cart for events" about 720 and "coffee cart catering" about 590 times. Those are buyers. The person who wants to start the business searches "coffee truck business plan" about 720 times and "coffee cart business plan" about 320 times, with a peak in January. Demand comes from companies booking corporate events, trade shows and brand activations, couples planning weddings, and families celebrating at home. This plan is for a barista-owner who wants to serve all three with a coffee cart and a portable espresso bar, working from a permitted commissary.</w:t>
+        <w:t>Coffee catering is easy for a client to book and hard to deliver well. Demand comes from companies booking corporate events, trade shows and brand activations, couples planning weddings, and families celebrating at home. On Flashquotes, a booking platform that published data on 25,860 coffee cart bookings from 578 operators, the typical event has about 100 guests and the median booking is $1,040. This plan is for a barista-owner who wants to serve all three with a coffee cart and a portable espresso bar, working from a permitted commissary.</w:t>
       </w:r>
     </w:p>
     <w:p>
       <w:r>
-        <w:t>The concept is a coffee catering company with two espresso stations: an espresso cart and a portable espresso bar, both carried in an enclosed trailer that the owner's own vehicle tows. The service is hosted: the host pays, and W-2 baristas serve espresso drinks, batch brew, cold brew, milks, syrups and compostable cups. Weekday corporate events are the volume (69.3% of real bookings on Flashquotes are corporate), weddings are the ticket, and private parties fill the rest. Festivals and farmers markets, where each guest pays, are a smaller complement, with a minimum sales guarantee from the organizer. The base is a commissary. This is not a coffee shop with a storefront, a food truck on a daily route or a bar that sells espresso martinis, which needs a license.</w:t>
+        <w:t>The concept is a coffee catering company with two espresso stations: an espresso cart and a portable espresso bar, both carried in an enclosed trailer that the owner's own vehicle tows. The service is hosted: the host pays, and W-2 baristas serve espresso drinks, batch brew, cold brew, milks, syrups and compostable cups. Weekday corporate events are the volume (69.3% of real bookings on Flashquotes are corporate), weddings are the ticket, and private parties fill the rest. Festivals and farmers markets, where each guest pays, are a smaller complement; some festival organizers offer a minimum sales guarantee. The base is a commissary. This is not a coffee shop with a storefront, a food truck on a daily route or a bar that sells espresso martinis, which needs a license.</w:t>
       </w:r>
     </w:p>
     <w:p>
       <w:r>
-        <w:t>The total startup investment is $100,290: $71,290 in startup costs plus $29,000 of working capital. The heavy lines are the espresso machines ($15,700) and the espresso cart ($13,400), followed by the trailer, the portable bar and the launch budget. For reference, cart-king.com puts a single cart with a used machine and a venue outlet at $16,600-24,000. We do not build or lease a storefront, which keeps the investment far below a coffee shop. We cover it with $30,000 of owner equity (30% of the total) and a $71,000 loan at 10.0% over 7 years. A loan of that size is above the $50,000 SBA Microloan cap, so the realistic routes are a bank loan or an SBA 7(a) loan, and no plan can promise a lender's answer.</w:t>
+        <w:t>The total startup investment is $100,290: $71,290 in startup costs plus $29,000 of working capital. The heavy lines are the espresso machines ($15,700) and the espresso cart ($13,400), followed by the trailer, the portable bar and the launch budget. For reference, cart-king.com puts the cart itself at $4,000-25,000 and a complete single-cart setup at about $16,600-49,000, with $24,000 typical. We do not build or lease a storefront, which keeps the investment far below a coffee shop. We cover it with $30,000 of owner equity (30% of the total) and a $71,000 loan at 10.0% over 7 years. A loan of that size is above the $50,000 SBA Microloan cap, so the realistic routes are a bank loan or an SBA 7(a) loan, and no plan can promise a lender's answer.</w:t>
       </w:r>
     </w:p>
     <w:p>
@@ -372,7 +372,7 @@
     </w:p>
     <w:p>
       <w:r>
-        <w:t>We compete against four alternatives. Other coffee carts and coffee trucks sell a similar experience, and the best of them are booked on the same dates we want. Neighborhood coffee shops that cater have a name but serve their own counter first. General caterers add coffee as one more item, often from a thermos. Self-serve coffee at hotels wins on price and loses on service. We place ourselves in the gap: two stations that make about 100 drinks an hour with two baristas, oat milk included, and a focus on weekday corporate events. We do not compete on price: Flashquotes shows the lowest tenth of bookings at $612 or less, which usually means poorly paid labor.</w:t>
+        <w:t>We compete against four alternatives. Other coffee carts and coffee trucks sell a similar experience, and the best of them are booked on the same dates we want. Neighborhood coffee shops that cater have a name but serve their own counter first. General caterers add coffee as one more item, often from a thermos. Self-serve coffee at hotels wins on price and loses on service. We place ourselves in the gap: two stations that make about 100 drinks an hour with two baristas, oat milk included, and a focus on weekday corporate events. We do not compete on price: on Flashquotes, the lowest tenth of bookings goes for $612 or less.</w:t>
       </w:r>
     </w:p>
     <w:p>
@@ -399,7 +399,7 @@
     </w:p>
     <w:p>
       <w:r>
-        <w:t>Demand for coffee catering comes from the buyer, and search data shows it. According to DataForSEO (October 2026), people in the U.S. search "coffee catering" about 2,900 times a month, "mobile coffee bar" about 880, "coffee cart for events" about 720 and "coffee bar for wedding" about 720 times. For events, searches that say "coffee cart" outnumber "coffee truck" searches by three to four times. These are people who want to hire a coffee service, not start one, so they confirm that demand exists without giving us a market size, which we do not quote because every source defines it differently. What matters for you is local: how many offices, venues and wedding planners sit within an hour of your commissary.</w:t>
+        <w:t>Demand for coffee catering comes from the buyer, and the useful measure is local. Check the demand in your own area: a keyword tool such as Google Keyword Planner shows how many people around you search for terms like "coffee catering" or "coffee cart for events." These are people who want to hire a coffee service, not start one. We do not quote a market size, because every source defines it differently. What matters for you is how many offices, venues and wedding planners sit within an hour of your commissary, and how many of them already book coffee for their events.</w:t>
       </w:r>
     </w:p>
     <w:p>
@@ -414,7 +414,7 @@
     </w:p>
     <w:p>
       <w:r>
-        <w:t>The example mix is a kit estimate, not market data. Of 170 events, 110 are corporate events, 30 are weddings, 20 are private parties and showers and 10 are festival or farmers market days with a minimum sales guarantee. The plan does not price each type separately: it models one blended average of $12.60 per guest across that mix, which gives $203,490 in year-1 revenue. Typical prices per guest run lower for large corporate groups and higher for small private parties. Corporate events are about 65% of the events. The calendar is uneven too. The example opens in March, so Month 1 is March, with peaks in March, May and December, and July books about a third of December on Flashquotes. The lowest cash balance falls in Month 7 at $17,705. Rotate the curve to your opening month.</w:t>
+        <w:t>The example mix is a kit estimate, not market data. Of 170 events, 110 are corporate events of about 90 guests, 30 are weddings of about 130, 20 are private parties and showers of about 45 and 10 are festival or market days of about 150 drinks, some with a minimum sales guarantee. The plan does not price each type separately: it models one blended average of $12.60 per guest across that mix, which gives $203,490 in year-1 revenue. Typical prices per guest run lower for large corporate groups and higher for small private parties. Corporate events are about 65% of the events. The calendar is uneven too. The example opens in March, so Month 1 is March, with peaks in March, May and December, and July books about a third of December on Flashquotes. The lowest cash balance falls in Month 7 at $17,705. Rotate the curve to your opening month.</w:t>
       </w:r>
     </w:p>
     <w:p>
@@ -456,17 +456,17 @@
     </w:p>
     <w:p>
       <w:r>
-        <w:t>Direct competitors are coffee carts and mobile espresso bars that serve the same events and the same venues, from weekend operators to full-service companies. Indirect ones are coffee shops that cater, thermos coffee from general caterers and self-serve coffee at hotels. To compare fairly, line up the price per booking and per guest, the hours included, whether oat milk is included or costs extra ($50 at Sweet Carolinas on zola.com), the free travel radius, and whether the generator is included ("no hidden generator or setup fees," as coffeecartboys.com puts it). Read their reviews on Google, The Knot, Zola and GigSalad. Then decide where you win and put it in one sentence.</w:t>
+        <w:t>Direct competitors are coffee carts and mobile espresso bars that serve the same events and the same venues, from weekend operators to full-service companies. Indirect ones are coffee shops that cater, thermos coffee from general caterers and self-serve coffee at hotels. To compare fairly, line up the price per booking and per guest, the hours included, whether oat milk is included or costs extra (Sweet Carolinas, on zola.com, includes oat milk and charges $50 for an additional alternative milk), the free travel radius, and whether the generator is included ("no hidden generator or setup fees," as coffeecartboys.com puts it). Read their reviews on Google, The Knot, Zola and GigSalad. Then decide where you win and put it in one sentence.</w:t>
       </w:r>
     </w:p>
     <w:p>
       <w:r>
-        <w:t>The barriers to entry are compliance and cash. You need a mobile food unit permit with a plan review, usually before you buy the cart, and a permitted commissary, because nothing is prepared at home. Add the gear: a two-group machine runs about $8,500 (a store price, kit estimate), and you need power, either a dedicated 220V circuit at the venue or a generator. Insurance with COIs for the venues comes next, and then the craft: a barista who keeps 50-65 drinks an hour moving at a corporate break. Cash weighs more than paperwork, because the machines, the trailer and the launch are paid before the first retainer.</w:t>
+        <w:t>The barriers to entry are compliance and cash, and both depend on the format. A coffee cart rolls into a ballroom or onto a lawn; cart-king.com puts a complete single-cart setup at about $16,600-49,000. A coffee trailer serves outdoors only and costs about $15,000 to build plus $10,000 to equip, and a coffee truck runs from about $20,000 used to $80,000 custom (greenjoecoffeeschool.com, 2019 prices). All three are mobile food units: you need a permit with a plan review, usually before you buy, and a permitted commissary, and a coffee truck also needs its own registration and commercial auto. This plan picks a cart plus a portable bar carried in an enclosed trailer: two stations that work indoors and outdoors, for far less than a custom coffee truck. Then come power (a two-group machine, about $8,500 at store prices, needs a dedicated 220V circuit or a generator), insurance with COIs for the venues, and the craft: a barista who keeps 50-65 drinks an hour moving.</w:t>
       </w:r>
     </w:p>
     <w:p>
       <w:r>
-        <w:t>Four factors decide whether it works. The first is speed and consistency: 50-65 drinks an hour per barista, with every drink dialed in. The second is food safety: milk is a TCS food, so keep it at 41 °F (5 °C) or below (FDA Food Code minimum) and write down the temperature. The third is punctuality at setup: arrive with time to spare, with the outlet confirmed. The fourth is your relationship with office managers, event planners and venues, who send many bookings, and the reviews they read. A small operator that does all four well can take work from larger rivals.</w:t>
+        <w:t>Four factors decide whether it works. The first is speed and consistency: 50-65 drinks an hour per barista, with every drink dialed in. The second is food safety: milk is a TCS food, so keep it at 41 °F (5 °C) or below (the FDA Food Code cold-holding limit) and write down the temperature. The third is punctuality at setup: arrive with time to spare, with the outlet confirmed. The fourth is your relationship with office managers, event planners and venues, who send many bookings, and the reviews they read. A small operator that does all four well can take work from larger rivals.</w:t>
       </w:r>
     </w:p>
     <w:p>
@@ -498,7 +498,7 @@
     </w:p>
     <w:p>
       <w:r>
-        <w:t>Your website is the main sales tool, because clients read it before they call. It should show the packages, "starting at" prices per guest for each type of event, photos of the cart at real events and a short quote form that asks for the date, the venue, the guest count and the service hours. Complete your Google Business Profile and keep collecting reviews, so you show up when someone searches "coffee catering," a phrase with about 2,900 searches a month. Instagram posts with latte art and the cart working at real events sell more than any slogan.</w:t>
+        <w:t>Your website is the main sales tool, because clients read it before they call. It should show the packages, "starting at" prices per guest for each type of event, photos of the cart at real events and a short quote form that asks for the date, the venue, the guest count and the service hours. Complete your Google Business Profile and keep collecting reviews, so you show up when someone nearby searches "coffee catering." Instagram posts with latte art and the cart working at real events sell more than any slogan.</w:t>
       </w:r>
     </w:p>
     <w:p>
@@ -560,7 +560,7 @@
     </w:p>
     <w:p>
       <w:r>
-        <w:t>Quality and safety are two different jobs. For quality, every double uses 18 g (0.63 oz) of coffee at a 1:2 ratio, which gives about 23 net doubles from a pound after purging and dialing in (kit estimate). Plan about 1.0 drinks per guest for a service of up to two hours, 1.3 to 1.5 for two to four hours, and 20-30% more in the morning, according to GrindKit. For safety, milk is a time and temperature control food, so we hold it at 41 °F (5 °C) or below (the FDA Food Code minimum) in the cart's refrigerator and in coolers, and we check it with a thermometer. Each milk gets its own pitcher, and we purge the steam wand between milks. Handwashing comes first, and we wipe the wand after every drink and rinse the portafilters between services. Milk, soy, tree nuts and, in pastries, wheat and egg go on every quote as allergens.</w:t>
+        <w:t>Quality and safety are two different jobs. For quality, every double uses 18 g (0.63 oz) of coffee at a 1:2 ratio, which gives about 23 net doubles from a pound after purging and dialing in (kit estimate). Plan about 1.0 drinks per guest for a service of up to two hours, 1.3 to 1.5 for two to four hours, and 20-30% more in the morning, according to GrindKit. For safety, milk is a time and temperature control food, so we hold it at 41 °F (5 °C) or below (the FDA Food Code cold-holding limit) in the cart's refrigerator and in coolers, and we check it with a thermometer. Each milk gets its own pitcher, and we purge the steam wand between milks. Handwashing comes first, and we wipe the wand after every drink and rinse the portafilters between services. Milk, soy, tree nuts and, in pastries, wheat and egg go on every quote as allergens.</w:t>
       </w:r>
     </w:p>
     <w:p>
@@ -649,7 +649,7 @@
     </w:p>
     <w:p>
       <w:r>
-        <w:t>The cost structure can be checked against reference ranges. The cost of goods on coffee bar package sales is 12%, and all goods together are 13.9% of sales. Compostable cups, lids, sleeves and napkins add 4.0%. Labor is 36.6% of sales, and the commissary, cart storage and trailer parking are 4.1%, or $8,400 a year. Marketing is $8,000 a year, insurance is $3,800 and year-1 interest is $7,100. For reference, GrindKit puts the all-in cost per drink at $0.75 to $1.50, with a cost of goods of 20-30% of drink revenue, and Flashquotes describes operator gross margins of 50-70%. If your cost per drink sits above that range, check your dose, your milk waste and your cup prices first.</w:t>
+        <w:t>The cost structure can be checked against reference ranges. The cost of goods on coffee bar package sales is 12%, and all goods together are 13.9% of sales. Compostable cups, lids, sleeves and napkins add 4.0%. Labor is 36.6% of sales, and the commissary, cart storage and trailer parking are 4.1%, or $8,400 a year. Marketing is $8,000 a year, insurance is $3,800 and year-1 interest is $7,100. For reference, GrindKit puts the all-in cost per drink at $0.75 to $1.50, with a cost of goods of 20-30% of drink revenue; package revenue also pays for the baristas, so goods are a smaller share here. Flashquotes describes operator gross margins of 50-70% after the event staff; this plan's 75.3% is before labor, and once the event baristas are paid it falls back into that range. If your cost per drink sits above that range, check your dose, your milk waste and your cup prices first.</w:t>
       </w:r>
     </w:p>
     <w:p>
@@ -659,7 +659,7 @@
     </w:p>
     <w:p>
       <w:r>
-        <w:t>You can fail on cash even when the profit looks good. The workbook assumes you collect from clients in 14 days on average and pay suppliers in 7 days, with payroll going out every month. The lowest cash balance is $17,705 in Month 7 (September, with Month 1 as March), after the summer dip and the first quarterly sales tax payment. The lowest debt service coverage is 2.58× and the payback before debt is 2.3 years. Retainers are not modeled, so real cash should be a little better.</w:t>
+        <w:t>You can fail on cash even when the profit looks good. The workbook assumes you collect from clients in 14 days on average and pay suppliers in 7 days, with payroll going out every month. The lowest cash balance is $17,705 in Month 7 (September in the example, which opens in March), after the summer dip and the sales tax payment due that month (the model settles in June, September and December). The lowest debt service coverage is 2.58× and the payback before debt is 2.3 years. Retainers are not modeled, so real cash should be a little better.</w:t>
       </w:r>
     </w:p>
     <w:p>
@@ -686,32 +686,32 @@
     </w:p>
     <w:p>
       <w:r>
-        <w:t>You cannot run a coffee catering business from your home kitchen, and the commissary is the legal anchor of this plan. A cart is a mobile food unit in states such as Washington and Indiana and a mobile food facility in California, and the process is the same as for a food truck. The FDA Food Code leaves the commissary decision to the local authority. As we read it, California's Health and Safety Code (section 114295) has mobile food facilities operate in conjunction with a commissary, and Snohomish County, Washington, requires one, with an annual agreement and a commissary log on board, unless a state exemption applies. So the answer is usually yes, and some counties exempt self-contained units: ask yours in writing before you buy the cart. This section is general information, not legal advice.</w:t>
+        <w:t>You cannot run a coffee catering business from your home kitchen, and the commissary is the legal anchor of this plan. A cart is a mobile food unit in states such as Washington and Indiana and a mobile food facility in California, and the process is the same as for a food truck. The FDA Food Code leaves the commissary decision to the local authority. California's Health and Safety Code (section 114295) generally requires a mobile food facility to operate in conjunction with an approved commissary or other approved facility, and Snohomish County, Washington, requires one, with an annual agreement and a commissary log on board, unless a state exemption applies. So the answer is usually yes, and some counties exempt self-contained units: ask yours in writing before you buy the cart. This section is general information, not legal advice.</w:t>
       </w:r>
     </w:p>
     <w:p>
       <w:r>
-        <w:t>With the commissary secured, the next layer is the health permit. Expect a mobile food unit permit and a plan review from your county, and ask for the plan review before you buy the cart. As one example we read, Snohomish County charges $1,100 for the plan review and $500, $745 or $1,025 a year for the permit depending on risk, and it wants the electrical approval first. Beyond that you need a business license, a sales tax permit, food handler cards for the whole team and, in some counties, a Certified Food Protection Manager; each festival or market may also ask for a temporary event permit. Milk is a time and temperature control food, so the cart needs an approved refrigerator that holds it at 41 °F (5 °C) or below (the FDA Food Code minimum), plus a handwashing sink with hot water and water tanks sized to your county's rule: check your county.</w:t>
+        <w:t>With the commissary secured, the next layer is the health permit. Expect a mobile food unit permit and a plan review from your county, and ask for the plan review before you buy the cart. As one example we read, Snohomish County charges $1,100 for the plan review and $500, $745 or $1,025 a year for the permit depending on risk, and it wants the electrical approval first. Beyond that you need a business license, a sales tax permit, food handler cards for the whole team and, in some counties, a Certified Food Protection Manager; each festival or market may also ask for a temporary event permit. Milk is a time and temperature control food, so the cart needs an approved refrigerator that holds it at 41 °F (5 °C) or below (the FDA Food Code cold-holding limit), plus a handwashing sink with hot water and water tanks sized to your county's rule: check your county.</w:t>
       </w:r>
     </w:p>
     <w:p>
       <w:r>
-        <w:t>Power is the question to ask first and the one most owners check last. A two-group machine at 220V and 3,400 W needs a dedicated circuit (NEMA 6-20, 15 to 17 A), so our checklist asks every room the same thing: 110V or 220V, how many amps and how far from the cart. If the room cannot deliver, the answer is an inverter generator of about 5,500 W. A coffee cart makes no grease-laden vapors, so it does not usually need a Type I hood, but the generator has its own rules. As one example, NFPA 96 asks for a generator at least 12 ft (3.7 m) from the unit, and a local fire code may ask for 10 ft from buildings and an extinguisher within reach; New Jersey asks for a Fire Safety Permit with a generator at every setup. Ask your fire marshal before you buy, and never assume that no permit is needed.</w:t>
+        <w:t>Power is the question to ask first and the one most owners check last. A two-group machine at 220V and 3,400 W needs a dedicated circuit (NEMA 6-20, 15 to 17 A), so our checklist asks every room the same thing: 110V or 220V, how many amps and how far from the cart. If the room cannot deliver, the answer is an inverter generator of about 5,500 W. A coffee cart makes no grease-laden vapors, so it does not usually need a Type I hood, but the generator has its own rules. As one example, a city fire department checklist (Lenexa, Kansas, based on NFPA 96) asks for a free-standing generator at least 12 ft (3.7 m) from the unit and 10 ft (3 m) from buildings, with an extinguisher on hand, and some states, such as New Jersey, may require a fire safety permit where a generator is used. Ask your fire marshal before you buy, and never assume that no permit is needed.</w:t>
       </w:r>
     </w:p>
     <w:p>
       <w:r>
-        <w:t>What we serve has its own rules. Pastries come only from a licensed bakery: cottage food laws let a home baker sell directly to the consumer, and reselling through a business is usually outside them, so check your state and never assume that cottage food pastries are fine. Cups are a local rule: the kit budgets compostable cups, and Seattle, as an example, requires single-use compostable items on site and has banned foam since 2009, while your city may say something different. There is no alcohol in this plan: an espresso martini needs a liquor license, so we partner with a licensed mobile bar. Declare the allergens on every quote: milk, soy and tree nuts such as almond and, in pastries, wheat and egg are among the nine major U.S. allergens, which also include sesame. Oat milk counts as gluten-free only if it is certified.</w:t>
+        <w:t>What we serve has its own rules. Pastries come only from a licensed bakery: cottage food laws let a home baker sell directly to the consumer, and reselling through a business is usually outside them, so check your state and never assume that cottage food pastries are fine. Cups are a local rule: the kit budgets compostable cups, and Seattle, as an example, requires single-use compostable items on site and has banned foam since 2009, while your city may say something different. There is no alcohol in this plan: an espresso martini needs a liquor license, so we partner with a licensed mobile bar. Declare the allergens on every quote: milk, soy and tree nuts such as almond and, in pastries, wheat and egg are among the nine major U.S. allergens, which also include sesame. Oat milk counts as gluten-free only if it is labeled gluten-free.</w:t>
       </w:r>
     </w:p>
     <w:p>
       <w:r>
-        <w:t>Sales tax depends on who pays. A hosted event is catering, and in many states, such as California and New York, the whole invoice is taxed, including staff, travel and extras. At festivals and farmers markets, where each guest pays for a drink, tax is charged drink by drink and may need a registration where you sell. Rate and taxability depend on your state and on who pays. Register for a sales tax permit; the workbook applies 8% to the whole invoice, which is the conservative choice. Under IRS Revenue Ruling 2012-18, a mandatory service charge is wages, not a tip, while a gratuity and a tip jar the host accepts are voluntary and belong to the team.</w:t>
+        <w:t>Sales tax depends on who pays. A hosted event is catering, and in many states, such as California and New York, the whole invoice is taxed, including staff and extras, and in some states travel. At festivals and farmers markets, where each guest pays for a drink, tax is charged drink by drink and may need a registration where you sell. Rate and taxability depend on your state and on who pays. Register for a sales tax permit; the workbook applies 8% to the whole invoice, which is the conservative choice. Under IRS Revenue Ruling 2012-18, a mandatory service charge is wages, not a tip, while a gratuity and a tip jar the host accepts are voluntary and belong to the team.</w:t>
       </w:r>
     </w:p>
     <w:p>
       <w:r>
-        <w:t>Hiring and insurance come next. Event baristas belong on W-2 payroll with workers' compensation (optional only in Texas, where venues and lenders still ask for it), Form I-9, Form W-4 and your state's new-hire reporting. The FLSA treats them as employees in almost every case, and California's AB5 presumes it, so a 1099 is a risk. The example budgets $3,800 a year for general liability of $1M/$2M with unlimited additional insureds, commercial auto that covers the trailer, workers' compensation and equipment in transit. Venues will ask for a certificate of insurance (COI) naming them as an additional insured. There is no alcohol in the plan, so there is no liquor liability.</w:t>
+        <w:t>Hiring and insurance come next. Event baristas belong on W-2 payroll with workers' compensation (optional only in Texas, where venues and lenders still ask for it), Form I-9, Form W-4 and your state's new-hire reporting. The FLSA treats them as employees in almost every case, and California's AB5 presumes it, so a 1099 is a risk. The example budgets a lean $3,800 a year (get quotes) for general liability of $1M/$2M with unlimited additional insureds, commercial auto that covers the trailer, workers' compensation and equipment in transit. Venues will ask for a certificate of insurance (COI) naming them as an additional insured. There is no alcohol in the plan, so there is no liquor liability.</w:t>
       </w:r>
     </w:p>
     <w:p>
@@ -743,7 +743,7 @@
     </w:p>
     <w:p>
       <w:r>
-        <w:t>Know the risks before you sign anything. A late cancellation is handled with the retainer and the cancellation tiers in the contract. A room with no 220V outlet is handled by asking in writing, by running a compact machine on 110V or by bringing the generator. Rain at an outdoor event is handled with a canopy or by moving inside, and the contract says rain is not force majeure. Milk out of temperature is the risk that can hurt a guest: it is prevented with a refrigerator and coolers that hold 41 °F (5 °C) or below (the FDA Food Code minimum), a thermometer and a rule that warm milk goes in the trash. A machine that fails mid-service is handled by the second station and a service contract with a technician. A slow July is handled with farmers markets, festivals and a cash reserve of about three months. A shortage of baristas in peak months is handled with a bench of trained part-time W-2 employees. Inspections hold no surprises if your permits, logs and commissary agreement are in order.</w:t>
+        <w:t>Know the risks before you sign anything. A late cancellation is handled with the retainer and the cancellation tiers in the contract. A room with no 220V outlet is handled by asking in writing, by running a compact machine on 110V or by bringing the generator. Rain at an outdoor event is handled with a canopy or by moving inside, and the contract says rain is not force majeure. Milk out of temperature is the risk that can hurt a guest: it is prevented with a refrigerator and coolers that hold 41 °F (5 °C) or below (the FDA Food Code cold-holding limit), a thermometer and a rule that warm milk goes in the trash. A machine that fails mid-service is handled by the second station and a service contract with a technician. A slow July is handled with farmers markets, festivals and a cash reserve of about three months. A shortage of baristas in peak months is handled with a bench of trained part-time W-2 employees. Inspections hold no surprises if your permits, logs and commissary agreement are in order.</w:t>
       </w:r>
     </w:p>
     <w:p>
@@ -753,7 +753,7 @@
     </w:p>
     <w:p>
       <w:r>
-        <w:t>The roadmap follows the six phases of the startup checklist that comes with the kit. "Phase 1 - Business Setup" covers the LLC, the tax registrations, the bank account, the loan application and your contract. "Phase 2 - Permits &amp; Commissary" covers the commissary agreement, the county plan review and health permit, the fire marshal and generator questions, the insurance and the cart order, in that order. "Phase 3 - Equipment" covers the machines, the grinders, the trailer, the brewing gear and a full test run with both stations. "Phase 4 - Staff" covers W-2 hiring, payroll and barista training. "Phase 5 - Marketing" builds the website, the Google Business Profile, the listings on The Knot, Zola and GigSalad, the outreach to planners, venues and office managers and the first tastings. "Phase 6 - First 90 Days" runs the first events and reviews each one against the plan. The phases overlap week by week, but do not book a paid event while any permit is still open.</w:t>
+        <w:t>The roadmap follows the six phases of the startup checklist that comes with the kit. "Phase 1 - Business Setup" covers the LLC, the tax registrations, the bank account, the loan application and your contract. "Phase 2 - Permits &amp; Commissary" covers the commissary agreement, the county plan review and health permit, the fire marshal and generator questions, the cart order and the insurance, in that order. "Phase 3 - Equipment" covers the machines, the grinders, the trailer, the brewing gear and a full test run with both stations. "Phase 4 - Staff" covers W-2 hiring, payroll and barista training. "Phase 5 - Marketing" builds the website, the Google Business Profile, the listings on The Knot, Zola and GigSalad, the outreach to planners, venues and office managers and the first tastings. "Phase 6 - First 90 Days" runs the first events and reviews each one against the plan. The phases overlap week by week, but do not book a paid event while any permit is still open.</w:t>
       </w:r>
     </w:p>
     <w:p>
@@ -768,7 +768,7 @@
     </w:p>
     <w:p>
       <w:r>
-        <w:t>The next steps are simple, and they go in order. Open the Excel workbook and replace the example figures with yours in the green cells: events per year, price per guest and guests per event. If you change one of them, this document falls behind, so the workbook rules. Use the pricing calculator, with its "Cost per Drink" and "Pricing Calculator" sheets, to turn your costs into quotes you can send, use the contract template for your bookings and use the checklist so no permit gets skipped. This plan is a planning tool, not legal or tax advice: confirm what applies to you with your accountant, your county health department and your fire marshal. And keep an eye on years 2 and 3, when the loan is being repaid and the cushion over cash break-even matters most.</w:t>
+        <w:t>The next steps are simple, and they go in order. Open the Excel workbook and replace the example figures with yours in the green cells: events per year, price per guest and guests per event. If you change one of them, this document falls behind, so the workbook rules. Use the pricing calculator, with its "Cost per Drink" and "Pricing Calculator" sheets, to turn your costs into quotes you can send, use the contract template for your bookings and use the checklist so no permit gets skipped. This plan is a planning tool, not legal or tax advice: confirm what applies to you with your accountant, your county health department and your fire marshal. And keep an eye on year 1, when the loan payment is already running and the cushion over cash break-even is thinnest (24%, rising in years 2 and 3).</w:t>
       </w:r>
     </w:p>
     <w:p>

</xml_diff>